<commit_message>
Update Practical 10: Implement complete Mini Project end-to-end data engineering solution
</commit_message>
<xml_diff>
--- a/Main_Data_Engineering_Practical_Manual_1_to_10_FINALom_CodeBoxes.docx
+++ b/Main_Data_Engineering_Practical_Manual_1_to_10_FINALom_CodeBoxes.docx
@@ -6291,7 +6291,7 @@
           <w:sz w:val="36"/>
           <w:szCs w:val="36"/>
         </w:rPr>
-        <w:t>Practical 10: Real-Time Data Streaming &amp; Anomaly Detection Pipeline</w:t>
+        <w:t>Practical 10: Mini Project — End-to-End Data Engineering Pipeline &amp; Data Warehouse Architecture</w:t>
       </w:r>
     </w:p>
     <w:p>
@@ -6304,7 +6304,7 @@
     </w:p>
     <w:p>
       <w:r>
-        <w:t>To design and implement a streaming data pipeline with real-time aggregation, threshold-based alert systems, and automated anomaly detection for high-volume e-commerce transaction streams.</w:t>
+        <w:t>To design and implement an end-to-end data engineering solution including data ingestion, cleaning, transformation, storage, data warehouse design (Star Schema dimensional modeling with Fact and Dimension tables), and business intelligence reporting. (Group of 2: Om Bichave &amp; Aryan Rane)</w:t>
       </w:r>
     </w:p>
     <w:p>
@@ -6312,7 +6312,7 @@
         <w:pStyle w:val="Heading2"/>
       </w:pPr>
       <w:r>
-        <w:t>Task 1: Real-Time Data Stream Simulator &amp; Sliding Window Aggregation</w:t>
+        <w:t>Task 1: Multi-Source Data Ingestion, Automated Cleaning &amp; Pipeline Transformation</w:t>
       </w:r>
     </w:p>
     <w:p>
@@ -6354,220 +6354,109 @@
                 <w:sz w:val="18"/>
                 <w:szCs w:val="18"/>
               </w:rPr>
-              <w:t>print("Name: Om Bichave &amp; Aryan Rane")</w:t>
-              <w:br/>
-              <w:br/>
-              <w:t>import pandas as pd</w:t>
-              <w:br/>
-              <w:t>import numpy as np</w:t>
-              <w:br/>
-              <w:t>import time</w:t>
-              <w:br/>
-              <w:t>from datetime import datetime, timedelta</w:t>
-              <w:br/>
-              <w:br/>
-              <w:t># Simulate continuous transaction stream generator</w:t>
-              <w:br/>
-              <w:t>def generate_stream_batch(batch_id):</w:t>
-              <w:br/>
-              <w:t xml:space="preserve">    np.random.seed(batch_id)</w:t>
-              <w:br/>
-              <w:t xml:space="preserve">    n_records = 10</w:t>
-              <w:br/>
-              <w:t xml:space="preserve">    timestamps = [datetime.now() - timedelta(seconds=i*2) for i in range(n_records)]</w:t>
-              <w:br/>
-              <w:t xml:space="preserve">    amounts = np.random.normal(loc=200, scale=50, size=n_records).round(2)</w:t>
-              <w:br/>
-              <w:t xml:space="preserve">    # Inject intentional anomaly</w:t>
-              <w:br/>
-              <w:t xml:space="preserve">    if batch_id == 2:</w:t>
-              <w:br/>
-              <w:t xml:space="preserve">        amounts[3] = 4500.00  # High monetary spike anomaly</w:t>
-              <w:br/>
-              <w:t xml:space="preserve">    </w:t>
-              <w:br/>
-              <w:t xml:space="preserve">    return pd.DataFrame({</w:t>
-              <w:br/>
-              <w:t xml:space="preserve">        "timestamp": timestamps,</w:t>
-              <w:br/>
-              <w:t xml:space="preserve">        "transaction_id": [f"TXN_{batch_id}_{i}" for i in range(n_records)],</w:t>
-              <w:br/>
-              <w:t xml:space="preserve">        "amount": amounts,</w:t>
-              <w:br/>
-              <w:t xml:space="preserve">        "user_id": [f"U{100 + (i % 4)}" for i in range(n_records)]</w:t>
-              <w:br/>
-              <w:t xml:space="preserve">    })</w:t>
-              <w:br/>
-              <w:br/>
-              <w:t># Sliding Window Aggregate Function (10-Second Moving Window)</w:t>
-              <w:br/>
-              <w:t>stream_buffer = pd.DataFrame()</w:t>
-              <w:br/>
-              <w:t>for b_id in range(1, 4):</w:t>
-              <w:br/>
-              <w:t xml:space="preserve">    batch = generate_stream_batch(b_id)</w:t>
-              <w:br/>
-              <w:t xml:space="preserve">    stream_buffer = pd.concat([stream_buffer, batch], ignore_index=True)</w:t>
-              <w:br/>
-              <w:t xml:space="preserve">    window_summary = stream_buffer.groupby("user_id").agg(</w:t>
-              <w:br/>
-              <w:t xml:space="preserve">        total_spent=("amount", "sum"),</w:t>
-              <w:br/>
-              <w:t xml:space="preserve">        txn_count=("transaction_id", "count"),</w:t>
-              <w:br/>
-              <w:t xml:space="preserve">        avg_spent=("amount", "mean")</w:t>
-              <w:br/>
-              <w:t xml:space="preserve">    ).reset_index()</w:t>
-              <w:br/>
-              <w:t xml:space="preserve">    print(f"--- Sliding Window Aggregation Batch {b_id} ---")</w:t>
-              <w:br/>
-              <w:t xml:space="preserve">    print(window_summary.head())</w:t>
-              <w:br/>
-            </w:r>
-          </w:p>
-          <w:p>
-            <w:pPr>
-              <w:spacing w:after="0" w:line="252" w:lineRule="auto"/>
-            </w:pPr>
-            <w:r>
-              <w:rPr>
-                <w:rFonts w:ascii="Consolas" w:hAnsi="Consolas"/>
-                <w:color w:val="282828"/>
-                <w:sz w:val="18"/>
-              </w:rPr>
-              <w:t>import pandas as pd, sqlite3</w:t>
-            </w:r>
-          </w:p>
-          <w:p>
-            <w:pPr>
-              <w:spacing w:after="0" w:line="252" w:lineRule="auto"/>
-            </w:pPr>
-          </w:p>
-          <w:p>
-            <w:pPr>
-              <w:spacing w:after="0" w:line="252" w:lineRule="auto"/>
-            </w:pPr>
-            <w:r>
-              <w:rPr>
-                <w:rFonts w:ascii="Consolas" w:hAnsi="Consolas"/>
-                <w:color w:val="282828"/>
-                <w:sz w:val="18"/>
-              </w:rPr>
-              <w:t>conn = sqlite3.connect("ecommerce_pipeline.db")</w:t>
-            </w:r>
-          </w:p>
-          <w:p>
-            <w:pPr>
-              <w:spacing w:after="0" w:line="252" w:lineRule="auto"/>
-            </w:pPr>
-          </w:p>
-          <w:p>
-            <w:pPr>
-              <w:spacing w:after="0" w:line="252" w:lineRule="auto"/>
-            </w:pPr>
-            <w:r>
-              <w:rPr>
-                <w:rFonts w:ascii="Consolas" w:hAnsi="Consolas"/>
-                <w:color w:val="282828"/>
-                <w:sz w:val="18"/>
-              </w:rPr>
-              <w:t>def process_new_data(incoming_df, db_conn):</w:t>
-            </w:r>
-          </w:p>
-          <w:p>
-            <w:pPr>
-              <w:spacing w:after="0" w:line="252" w:lineRule="auto"/>
-            </w:pPr>
-            <w:r>
-              <w:rPr>
-                <w:rFonts w:ascii="Consolas" w:hAnsi="Consolas"/>
-                <w:color w:val="282828"/>
-                <w:sz w:val="18"/>
-              </w:rPr>
-              <w:t xml:space="preserve">    existing = pd.read_sql("SELECT order_id FROM cleaned_orders", db_conn)["order_id"].tolist()</w:t>
-            </w:r>
-          </w:p>
-          <w:p>
-            <w:pPr>
-              <w:spacing w:after="0" w:line="252" w:lineRule="auto"/>
-            </w:pPr>
-            <w:r>
-              <w:rPr>
-                <w:rFonts w:ascii="Consolas" w:hAnsi="Consolas"/>
-                <w:color w:val="282828"/>
-                <w:sz w:val="18"/>
-              </w:rPr>
-              <w:t xml:space="preserve">    new_data = incoming_df[~incoming_df["order_id"].isin(existing)].copy()</w:t>
-            </w:r>
-          </w:p>
-          <w:p>
-            <w:pPr>
-              <w:spacing w:after="0" w:line="252" w:lineRule="auto"/>
-            </w:pPr>
-            <w:r>
-              <w:rPr>
-                <w:rFonts w:ascii="Consolas" w:hAnsi="Consolas"/>
-                <w:color w:val="282828"/>
-                <w:sz w:val="18"/>
-              </w:rPr>
-              <w:t xml:space="preserve">    if not new_data.empty:</w:t>
-            </w:r>
-          </w:p>
-          <w:p>
-            <w:pPr>
-              <w:spacing w:after="0" w:line="252" w:lineRule="auto"/>
-            </w:pPr>
-            <w:r>
-              <w:rPr>
-                <w:rFonts w:ascii="Consolas" w:hAnsi="Consolas"/>
-                <w:color w:val="282828"/>
-                <w:sz w:val="18"/>
-              </w:rPr>
-              <w:t xml:space="preserve">        new_data["total_amount"] = new_data["quantity"] * new_data["price"]</w:t>
-            </w:r>
-          </w:p>
-          <w:p>
-            <w:pPr>
-              <w:spacing w:after="0" w:line="252" w:lineRule="auto"/>
-            </w:pPr>
-            <w:r>
-              <w:rPr>
-                <w:rFonts w:ascii="Consolas" w:hAnsi="Consolas"/>
-                <w:color w:val="282828"/>
-                <w:sz w:val="18"/>
-              </w:rPr>
-              <w:t xml:space="preserve">        new_data.to_sql("cleaned_orders", db_conn, if_exists="append", index=False)</w:t>
-            </w:r>
-          </w:p>
-          <w:p>
-            <w:pPr>
-              <w:spacing w:after="0" w:line="252" w:lineRule="auto"/>
-            </w:pPr>
-            <w:r>
-              <w:rPr>
-                <w:rFonts w:ascii="Consolas" w:hAnsi="Consolas"/>
-                <w:color w:val="282828"/>
-                <w:sz w:val="18"/>
-              </w:rPr>
-              <w:t xml:space="preserve">        print(f"Successfully processed and appended {len(new_data)} new records.")</w:t>
-            </w:r>
-          </w:p>
-          <w:p>
-            <w:pPr>
-              <w:spacing w:after="0" w:line="252" w:lineRule="auto"/>
-            </w:pPr>
-          </w:p>
-          <w:p>
-            <w:pPr>
-              <w:spacing w:after="0" w:line="252" w:lineRule="auto"/>
-            </w:pPr>
-            <w:r>
-              <w:rPr>
-                <w:rFonts w:ascii="Consolas" w:hAnsi="Consolas"/>
-                <w:color w:val="282828"/>
-                <w:sz w:val="18"/>
-              </w:rPr>
-              <w:t>process_new_data(new_arriving_data, conn)</w:t>
+              <w:t xml:space="preserve"># Practical 10: Mini Project — End-to-End Data Engineering Pipeline</w:t>
+              <w:br/>
+              <w:t xml:space="preserve"># Group Members (Group of 2): Om Bichave &amp; Aryan Rane</w:t>
+              <w:br/>
+              <w:t xml:space="preserve">from datetime import datetime, timedelta</w:t>
+              <w:br/>
+              <w:t xml:space="preserve">import numpy as np</w:t>
+              <w:br/>
+              <w:t xml:space="preserve">import pandas as pd</w:t>
+              <w:br/>
+              <w:t xml:space="preserve"/>
+              <w:br/>
+              <w:t xml:space="preserve">np.random.seed(42)</w:t>
+              <w:br/>
+              <w:t xml:space="preserve"/>
+              <w:br/>
+              <w:t xml:space="preserve"># 1. Multi-Source Ingestion: Customers, Products, and Order Transaction Stream</w:t>
+              <w:br/>
+              <w:t xml:space="preserve">raw_customers = pd.DataFrame({</w:t>
+              <w:br/>
+              <w:t xml:space="preserve">    "customer_id": [f"C{100+i}" for i in range(1, 11)],</w:t>
+              <w:br/>
+              <w:t xml:space="preserve">    "customer_name": ["Alice Smith", "Bob Jones", "Charlie Brown", "David Lee", "Emma Watson",</w:t>
+              <w:br/>
+              <w:t xml:space="preserve">                      "Frank Miller", "Grace Hopper", "Henry Ford", "Ivy Taylor", "Jack Ryan"],</w:t>
+              <w:br/>
+              <w:t xml:space="preserve">    "city": ["Mumbai", "Pune", "Bangalore", "Mumbai", "Delhi", "Pune", "Hyderabad", "Bangalore", "Chennai", "Delhi"]</w:t>
+              <w:br/>
+              <w:t xml:space="preserve">})</w:t>
+              <w:br/>
+              <w:t xml:space="preserve"/>
+              <w:br/>
+              <w:t xml:space="preserve">raw_products = pd.DataFrame({</w:t>
+              <w:br/>
+              <w:t xml:space="preserve">    "product_id": [f"P{200+i}" for i in range(1, 7)],</w:t>
+              <w:br/>
+              <w:t xml:space="preserve">    "product_name": ["Ultra Laptop Pro", "Ergonomic Mouse", "Mechanical Keyboard", </w:t>
+              <w:br/>
+              <w:t xml:space="preserve">                     "4K Monitor 27inch", "USB-C Hub Multiport", "Noise-Cancelling Headphones"],</w:t>
+              <w:br/>
+              <w:t xml:space="preserve">    "category": ["Computers", "Accessories", "Accessories", "Displays", "Accessories", "Audio"],</w:t>
+              <w:br/>
+              <w:t xml:space="preserve">    "unit_price": [1200.0, 35.0, 85.0, 350.0, 45.0, 180.0],</w:t>
+              <w:br/>
+              <w:t xml:space="preserve">    "unit_cost": [850.0, 15.0, 40.0, 220.0, 20.0, 95.0]</w:t>
+              <w:br/>
+              <w:t xml:space="preserve">})</w:t>
+              <w:br/>
+              <w:t xml:space="preserve"/>
+              <w:br/>
+              <w:t xml:space="preserve">raw_orders = pd.DataFrame({</w:t>
+              <w:br/>
+              <w:t xml:space="preserve">    "order_id": [f"ORD{1000+i}" for i in range(30)],</w:t>
+              <w:br/>
+              <w:t xml:space="preserve">    "customer_id": [f"C{100 + np.random.randint(1, 11)}" for _ in range(30)],</w:t>
+              <w:br/>
+              <w:t xml:space="preserve">    "product_id": [f"P{200 + np.random.randint(1, 7)}" for _ in range(30)],</w:t>
+              <w:br/>
+              <w:t xml:space="preserve">    "order_date": [(datetime(2026, 1, 1) + timedelta(days=int(d))).strftime("%Y-%m-%d") for d in np.random.randint(0, 90, 30)],</w:t>
+              <w:br/>
+              <w:t xml:space="preserve">    "quantity": [np.random.randint(1, 6) for _ in range(30)],</w:t>
+              <w:br/>
+              <w:t xml:space="preserve">    "discount_pct": [np.random.choice([0.0, 0.05, 0.10, 0.15, 0.20]) for _ in range(30)]</w:t>
+              <w:br/>
+              <w:t xml:space="preserve">})</w:t>
+              <w:br/>
+              <w:t xml:space="preserve"/>
+              <w:br/>
+              <w:t xml:space="preserve"># Injected dirty records &amp; duplicates</w:t>
+              <w:br/>
+              <w:t xml:space="preserve">raw_orders = pd.concat([raw_orders, raw_orders.iloc[[2]], raw_orders.iloc[[7]]], ignore_index=True)</w:t>
+              <w:br/>
+              <w:t xml:space="preserve">raw_orders.loc[4, "quantity"] = -3</w:t>
+              <w:br/>
+              <w:t xml:space="preserve">raw_orders.loc[12, "discount_pct"] = np.nan</w:t>
+              <w:br/>
+              <w:t xml:space="preserve"/>
+              <w:br/>
+              <w:t xml:space="preserve"># 2. Automated Data Cleaning &amp; Anomaly Remediation</w:t>
+              <w:br/>
+              <w:t xml:space="preserve">df_orders = raw_orders.drop_duplicates(subset=["order_id"]).copy()</w:t>
+              <w:br/>
+              <w:t xml:space="preserve">df_orders = df_orders[df_orders["quantity"] &gt; 0].copy()</w:t>
+              <w:br/>
+              <w:t xml:space="preserve">df_orders["discount_pct"] = df_orders["discount_pct"].fillna(0.0)</w:t>
+              <w:br/>
+              <w:t xml:space="preserve"/>
+              <w:br/>
+              <w:t xml:space="preserve"># 3. Pipeline Transformation &amp; Financial Feature Enrichment</w:t>
+              <w:br/>
+              <w:t xml:space="preserve">df_transformed = df_orders.merge(raw_products[["product_id", "unit_price", "unit_cost"]], on="product_id", how="inner")</w:t>
+              <w:br/>
+              <w:t xml:space="preserve">df_transformed["gross_amount"] = (df_transformed["quantity"] * df_transformed["unit_price"]).round(2)</w:t>
+              <w:br/>
+              <w:t xml:space="preserve">df_transformed["discount_amount"] = (df_transformed["gross_amount"] * df_transformed["discount_pct"]).round(2)</w:t>
+              <w:br/>
+              <w:t xml:space="preserve">df_transformed["net_amount"] = (df_transformed["gross_amount"] - df_transformed["discount_amount"]).round(2)</w:t>
+              <w:br/>
+              <w:t xml:space="preserve">df_transformed["total_cost"] = (df_transformed["quantity"] * df_transformed["unit_cost"]).round(2)</w:t>
+              <w:br/>
+              <w:t xml:space="preserve">df_transformed["profit"] = (df_transformed["net_amount"] - df_transformed["total_cost"]).round(2)</w:t>
+              <w:br/>
+              <w:t xml:space="preserve">print("Data Ingestion, Cleaning &amp; Financial Transformation Complete.")</w:t>
             </w:r>
           </w:p>
         </w:tc>
@@ -6580,17 +6469,17 @@
     </w:p>
     <w:p>
       <w:pPr>
-        <w:pStyle w:val="Heading2"/>
+        <w:spacing w:before="120" w:after="160"/>
       </w:pPr>
       <w:r>
         <w:rPr>
           <w:noProof/>
         </w:rPr>
         <w:drawing>
-          <wp:inline distT="0" distB="0" distL="0" distR="0" wp14:anchorId="5B1C81D2" wp14:editId="6FAD2D2D">
-            <wp:extent cx="3991532" cy="2514951"/>
-            <wp:effectExtent l="0" t="0" r="9525" b="0"/>
-            <wp:docPr id="1" name="Picture 1"/>
+          <wp:inline distT="0" distB="0" distL="0" distR="0">
+            <wp:extent cx="5486400" cy="2956270"/>
+            <wp:effectExtent l="0" t="0" r="0" b="0"/>
+            <wp:docPr id="700000001" name="Picture 700000001"/>
             <wp:cNvGraphicFramePr>
               <a:graphicFrameLocks xmlns:a="http://schemas.openxmlformats.org/drawingml/2006/main" noChangeAspect="1"/>
             </wp:cNvGraphicFramePr>
@@ -6598,7 +6487,7 @@
               <a:graphicData uri="http://schemas.openxmlformats.org/drawingml/2006/picture">
                 <pic:pic xmlns:pic="http://schemas.openxmlformats.org/drawingml/2006/picture">
                   <pic:nvPicPr>
-                    <pic:cNvPr id="1" name=""/>
+                    <pic:cNvPr id="700000001" name=""/>
                     <pic:cNvPicPr/>
                   </pic:nvPicPr>
                   <pic:blipFill>
@@ -6610,7 +6499,7 @@
                   <pic:spPr>
                     <a:xfrm>
                       <a:off x="0" y="0"/>
-                      <a:ext cx="3991532" cy="2514951"/>
+                      <a:ext cx="5486400" cy="2956270"/>
                     </a:xfrm>
                     <a:prstGeom prst="rect">
                       <a:avLst/>
@@ -6628,7 +6517,7 @@
         <w:pStyle w:val="Heading2"/>
       </w:pPr>
       <w:r>
-        <w:t>Task 2: Real-Time Anomaly Detection Engine (Z-Score &amp; Threshold Monitoring)</w:t>
+        <w:t>Task 2: Operational Data Storage (ODS) &amp; Enterprise Star Schema Dimensional Modeling</w:t>
       </w:r>
     </w:p>
     <w:p>
@@ -6670,194 +6559,197 @@
                 <w:sz w:val="18"/>
                 <w:szCs w:val="18"/>
               </w:rPr>
-              <w:t>print("Name: Om Bichave &amp; Aryan Rane")</w:t>
-              <w:br/>
-              <w:br/>
-              <w:t>def detect_anomalies(df, threshold_z=2.5, max_amount_limit=3000):</w:t>
-              <w:br/>
-              <w:t xml:space="preserve">    df["mean"] = df["amount"].mean()</w:t>
-              <w:br/>
-              <w:t xml:space="preserve">    df["std"] = df["amount"].std()</w:t>
-              <w:br/>
-              <w:t xml:space="preserve">    df["z_score"] = (df["amount"] - df["mean"]) / df["std"]</w:t>
-              <w:br/>
-              <w:t xml:space="preserve">    </w:t>
-              <w:br/>
-              <w:t xml:space="preserve">    # Dynamic Rule Evaluation</w:t>
-              <w:br/>
-              <w:t xml:space="preserve">    anomalies = df[(</w:t>
-              <w:br/>
-              <w:t xml:space="preserve">        (df["z_score"].abs() &gt; threshold_z) |</w:t>
-              <w:br/>
-              <w:t xml:space="preserve">        (df["amount"] &gt; max_amount_limit)</w:t>
-              <w:br/>
-              <w:t xml:space="preserve">    )].copy()</w:t>
-              <w:br/>
-              <w:t xml:space="preserve">    </w:t>
-              <w:br/>
-              <w:t xml:space="preserve">    anomalies["flag_reason"] = np.where(</w:t>
-              <w:br/>
-              <w:t xml:space="preserve">        anomalies["amount"] &gt; max_amount_limit, </w:t>
-              <w:br/>
-              <w:t xml:space="preserve">        "Exceeded Static Monetary Limit", </w:t>
-              <w:br/>
-              <w:t xml:space="preserve">        "Statistical Outlier (Z-Score)"</w:t>
-              <w:br/>
-              <w:t xml:space="preserve">    )</w:t>
-              <w:br/>
-              <w:t xml:space="preserve">    return anomalies[["transaction_id", "user_id", "amount", "z_score", "flag_reason"]]</w:t>
-              <w:br/>
-              <w:br/>
-              <w:t>detected_anomalies = detect_anomalies(stream_buffer)</w:t>
-              <w:br/>
-              <w:t>print("Detected Real-Time Stream Anomalies:")</w:t>
-              <w:br/>
-              <w:t>print(detected_anomalies)</w:t>
-            </w:r>
-          </w:p>
-          <w:p>
-            <w:pPr>
-              <w:spacing w:after="0" w:line="252" w:lineRule="auto"/>
-            </w:pPr>
-            <w:r>
-              <w:rPr>
-                <w:rFonts w:ascii="Consolas" w:hAnsi="Consolas"/>
-                <w:color w:val="282828"/>
-                <w:sz w:val="18"/>
-              </w:rPr>
-              <w:t>import pandas as pd, sqlite3</w:t>
-            </w:r>
-          </w:p>
-          <w:p>
-            <w:pPr>
-              <w:spacing w:after="0" w:line="252" w:lineRule="auto"/>
-            </w:pPr>
-          </w:p>
-          <w:p>
-            <w:pPr>
-              <w:spacing w:after="0" w:line="252" w:lineRule="auto"/>
-            </w:pPr>
-            <w:r>
-              <w:rPr>
-                <w:rFonts w:ascii="Consolas" w:hAnsi="Consolas"/>
-                <w:color w:val="282828"/>
-                <w:sz w:val="18"/>
-              </w:rPr>
-              <w:t>conn = sqlite3.connect("ecommerce_pipeline.db")</w:t>
-            </w:r>
-          </w:p>
-          <w:p>
-            <w:pPr>
-              <w:spacing w:after="0" w:line="252" w:lineRule="auto"/>
-            </w:pPr>
-          </w:p>
-          <w:p>
-            <w:pPr>
-              <w:spacing w:after="0" w:line="252" w:lineRule="auto"/>
-            </w:pPr>
-            <w:r>
-              <w:rPr>
-                <w:rFonts w:ascii="Consolas" w:hAnsi="Consolas"/>
-                <w:color w:val="282828"/>
-                <w:sz w:val="18"/>
-              </w:rPr>
-              <w:t>def process_new_data(incoming_df, db_conn):</w:t>
-            </w:r>
-          </w:p>
-          <w:p>
-            <w:pPr>
-              <w:spacing w:after="0" w:line="252" w:lineRule="auto"/>
-            </w:pPr>
-            <w:r>
-              <w:rPr>
-                <w:rFonts w:ascii="Consolas" w:hAnsi="Consolas"/>
-                <w:color w:val="282828"/>
-                <w:sz w:val="18"/>
-              </w:rPr>
-              <w:t xml:space="preserve">    existing = pd.read_sql("SELECT order_id FROM cleaned_orders", db_conn)["order_id"].tolist()</w:t>
-            </w:r>
-          </w:p>
-          <w:p>
-            <w:pPr>
-              <w:spacing w:after="0" w:line="252" w:lineRule="auto"/>
-            </w:pPr>
-            <w:r>
-              <w:rPr>
-                <w:rFonts w:ascii="Consolas" w:hAnsi="Consolas"/>
-                <w:color w:val="282828"/>
-                <w:sz w:val="18"/>
-              </w:rPr>
-              <w:t xml:space="preserve">    new_data = incoming_df[~incoming_df["order_id"].isin(existing)].copy()</w:t>
-            </w:r>
-          </w:p>
-          <w:p>
-            <w:pPr>
-              <w:spacing w:after="0" w:line="252" w:lineRule="auto"/>
-            </w:pPr>
-            <w:r>
-              <w:rPr>
-                <w:rFonts w:ascii="Consolas" w:hAnsi="Consolas"/>
-                <w:color w:val="282828"/>
-                <w:sz w:val="18"/>
-              </w:rPr>
-              <w:t xml:space="preserve">    if not new_data.empty:</w:t>
-            </w:r>
-          </w:p>
-          <w:p>
-            <w:pPr>
-              <w:spacing w:after="0" w:line="252" w:lineRule="auto"/>
-            </w:pPr>
-            <w:r>
-              <w:rPr>
-                <w:rFonts w:ascii="Consolas" w:hAnsi="Consolas"/>
-                <w:color w:val="282828"/>
-                <w:sz w:val="18"/>
-              </w:rPr>
-              <w:t xml:space="preserve">        new_data["total_amount"] = new_data["quantity"] * new_data["price"]</w:t>
-            </w:r>
-          </w:p>
-          <w:p>
-            <w:pPr>
-              <w:spacing w:after="0" w:line="252" w:lineRule="auto"/>
-            </w:pPr>
-            <w:r>
-              <w:rPr>
-                <w:rFonts w:ascii="Consolas" w:hAnsi="Consolas"/>
-                <w:color w:val="282828"/>
-                <w:sz w:val="18"/>
-              </w:rPr>
-              <w:t xml:space="preserve">        new_data.to_sql("cleaned_orders", db_conn, if_exists="append", index=False)</w:t>
-            </w:r>
-          </w:p>
-          <w:p>
-            <w:pPr>
-              <w:spacing w:after="0" w:line="252" w:lineRule="auto"/>
-            </w:pPr>
-            <w:r>
-              <w:rPr>
-                <w:rFonts w:ascii="Consolas" w:hAnsi="Consolas"/>
-                <w:color w:val="282828"/>
-                <w:sz w:val="18"/>
-              </w:rPr>
-              <w:t xml:space="preserve">        print(f"Successfully processed and appended {len(new_data)} new records.")</w:t>
-            </w:r>
-          </w:p>
-          <w:p>
-            <w:pPr>
-              <w:spacing w:after="0" w:line="252" w:lineRule="auto"/>
-            </w:pPr>
-          </w:p>
-          <w:p>
-            <w:pPr>
-              <w:spacing w:after="0" w:line="252" w:lineRule="auto"/>
-            </w:pPr>
-            <w:r>
-              <w:rPr>
-                <w:rFonts w:ascii="Consolas" w:hAnsi="Consolas"/>
-                <w:color w:val="282828"/>
-                <w:sz w:val="18"/>
-              </w:rPr>
-              <w:t>process_new_data(new_arriving_data, conn)</w:t>
+              <w:t xml:space="preserve"># Group Members: Om Bichave &amp; Aryan Rane</w:t>
+              <w:br/>
+              <w:t xml:space="preserve">import sqlite3</w:t>
+              <w:br/>
+              <w:t xml:space="preserve">import pandas as pd</w:t>
+              <w:br/>
+              <w:t xml:space="preserve"/>
+              <w:br/>
+              <w:t xml:space="preserve">conn = sqlite3.connect("enterprise_data_warehouse.db")</w:t>
+              <w:br/>
+              <w:t xml:space="preserve">cursor = conn.cursor()</w:t>
+              <w:br/>
+              <w:t xml:space="preserve"/>
+              <w:br/>
+              <w:t xml:space="preserve"># 1. Operational Staging Persistence</w:t>
+              <w:br/>
+              <w:t xml:space="preserve">raw_customers.to_sql("ods_customers", conn, if_exists="replace", index=False)</w:t>
+              <w:br/>
+              <w:t xml:space="preserve">raw_products.to_sql("ods_products", conn, if_exists="replace", index=False)</w:t>
+              <w:br/>
+              <w:t xml:space="preserve">df_transformed.to_sql("ods_orders", conn, if_exists="replace", index=False)</w:t>
+              <w:br/>
+              <w:t xml:space="preserve"/>
+              <w:br/>
+              <w:t xml:space="preserve"># 2. Enterprise Data Warehouse — Star Schema DDL</w:t>
+              <w:br/>
+              <w:t xml:space="preserve">cursor.executescript('''</w:t>
+              <w:br/>
+              <w:t xml:space="preserve">DROP TABLE IF EXISTS Fact_Sales;</w:t>
+              <w:br/>
+              <w:t xml:space="preserve">DROP TABLE IF EXISTS Dim_Customer;</w:t>
+              <w:br/>
+              <w:t xml:space="preserve">DROP TABLE IF EXISTS Dim_Product;</w:t>
+              <w:br/>
+              <w:t xml:space="preserve">DROP TABLE IF EXISTS Dim_Date;</w:t>
+              <w:br/>
+              <w:t xml:space="preserve"/>
+              <w:br/>
+              <w:t xml:space="preserve">CREATE TABLE Dim_Customer (</w:t>
+              <w:br/>
+              <w:t xml:space="preserve">    customer_key INTEGER PRIMARY KEY AUTOINCREMENT,</w:t>
+              <w:br/>
+              <w:t xml:space="preserve">    customer_id TEXT UNIQUE,</w:t>
+              <w:br/>
+              <w:t xml:space="preserve">    customer_name TEXT,</w:t>
+              <w:br/>
+              <w:t xml:space="preserve">    city TEXT,</w:t>
+              <w:br/>
+              <w:t xml:space="preserve">    tier TEXT</w:t>
+              <w:br/>
+              <w:t xml:space="preserve">);</w:t>
+              <w:br/>
+              <w:t xml:space="preserve"/>
+              <w:br/>
+              <w:t xml:space="preserve">CREATE TABLE Dim_Product (</w:t>
+              <w:br/>
+              <w:t xml:space="preserve">    product_key INTEGER PRIMARY KEY AUTOINCREMENT,</w:t>
+              <w:br/>
+              <w:t xml:space="preserve">    product_id TEXT UNIQUE,</w:t>
+              <w:br/>
+              <w:t xml:space="preserve">    product_name TEXT,</w:t>
+              <w:br/>
+              <w:t xml:space="preserve">    category TEXT,</w:t>
+              <w:br/>
+              <w:t xml:space="preserve">    unit_price REAL,</w:t>
+              <w:br/>
+              <w:t xml:space="preserve">    unit_cost REAL</w:t>
+              <w:br/>
+              <w:t xml:space="preserve">);</w:t>
+              <w:br/>
+              <w:t xml:space="preserve"/>
+              <w:br/>
+              <w:t xml:space="preserve">CREATE TABLE Dim_Date (</w:t>
+              <w:br/>
+              <w:t xml:space="preserve">    date_key INTEGER PRIMARY KEY,</w:t>
+              <w:br/>
+              <w:t xml:space="preserve">    full_date TEXT UNIQUE,</w:t>
+              <w:br/>
+              <w:t xml:space="preserve">    year INTEGER,</w:t>
+              <w:br/>
+              <w:t xml:space="preserve">    quarter INTEGER,</w:t>
+              <w:br/>
+              <w:t xml:space="preserve">    month INTEGER,</w:t>
+              <w:br/>
+              <w:t xml:space="preserve">    month_name TEXT,</w:t>
+              <w:br/>
+              <w:t xml:space="preserve">    day INTEGER,</w:t>
+              <w:br/>
+              <w:t xml:space="preserve">    day_name TEXT</w:t>
+              <w:br/>
+              <w:t xml:space="preserve">);</w:t>
+              <w:br/>
+              <w:t xml:space="preserve"/>
+              <w:br/>
+              <w:t xml:space="preserve">CREATE TABLE Fact_Sales (</w:t>
+              <w:br/>
+              <w:t xml:space="preserve">    sales_key INTEGER PRIMARY KEY AUTOINCREMENT,</w:t>
+              <w:br/>
+              <w:t xml:space="preserve">    customer_key INTEGER,</w:t>
+              <w:br/>
+              <w:t xml:space="preserve">    product_key INTEGER,</w:t>
+              <w:br/>
+              <w:t xml:space="preserve">    date_key INTEGER,</w:t>
+              <w:br/>
+              <w:t xml:space="preserve">    order_id TEXT,</w:t>
+              <w:br/>
+              <w:t xml:space="preserve">    quantity INTEGER,</w:t>
+              <w:br/>
+              <w:t xml:space="preserve">    gross_amount REAL,</w:t>
+              <w:br/>
+              <w:t xml:space="preserve">    discount_amount REAL,</w:t>
+              <w:br/>
+              <w:t xml:space="preserve">    net_amount REAL,</w:t>
+              <w:br/>
+              <w:t xml:space="preserve">    profit REAL,</w:t>
+              <w:br/>
+              <w:t xml:space="preserve">    FOREIGN KEY (customer_key) REFERENCES Dim_Customer(customer_key),</w:t>
+              <w:br/>
+              <w:t xml:space="preserve">    FOREIGN KEY (product_key) REFERENCES Dim_Product(product_key),</w:t>
+              <w:br/>
+              <w:t xml:space="preserve">    FOREIGN KEY (date_key) REFERENCES Dim_Date(date_key)</w:t>
+              <w:br/>
+              <w:t xml:space="preserve">);</w:t>
+              <w:br/>
+              <w:t xml:space="preserve">''')</w:t>
+              <w:br/>
+              <w:t xml:space="preserve"/>
+              <w:br/>
+              <w:t xml:space="preserve"># 3. Populate Dimensions &amp; Fact Table via Dimensional Lookups</w:t>
+              <w:br/>
+              <w:t xml:space="preserve">customer_spend = df_transformed.groupby("customer_id")["net_amount"].sum()</w:t>
+              <w:br/>
+              <w:t xml:space="preserve">raw_customers["tier"] = raw_customers["customer_id"].apply(</w:t>
+              <w:br/>
+              <w:t xml:space="preserve">    lambda c: "Gold Tier" if customer_spend.get(c, 0) &gt; 2500 else ("Silver Tier" if customer_spend.get(c, 0) &gt; 1000 else "Bronze Tier")</w:t>
+              <w:br/>
+              <w:t xml:space="preserve">)</w:t>
+              <w:br/>
+              <w:t xml:space="preserve"/>
+              <w:br/>
+              <w:t xml:space="preserve">for _, r in raw_customers.iterrows():</w:t>
+              <w:br/>
+              <w:t xml:space="preserve">    cursor.execute("INSERT INTO Dim_Customer (customer_id, customer_name, city, tier) VALUES (?, ?, ?, ?)",</w:t>
+              <w:br/>
+              <w:t xml:space="preserve">                   (r["customer_id"], r["customer_name"], r["city"], r["tier"]))</w:t>
+              <w:br/>
+              <w:t xml:space="preserve"/>
+              <w:br/>
+              <w:t xml:space="preserve">for _, r in raw_products.iterrows():</w:t>
+              <w:br/>
+              <w:t xml:space="preserve">    cursor.execute("INSERT INTO Dim_Product (product_id, product_name, category, unit_price, unit_cost) VALUES (?, ?, ?, ?, ?)",</w:t>
+              <w:br/>
+              <w:t xml:space="preserve">                   (r["product_id"], r["product_name"], r["category"], r["unit_price"], r["unit_cost"]))</w:t>
+              <w:br/>
+              <w:t xml:space="preserve"/>
+              <w:br/>
+              <w:t xml:space="preserve">for d in pd.to_datetime(df_transformed["order_date"].unique()):</w:t>
+              <w:br/>
+              <w:t xml:space="preserve">    cursor.execute('''INSERT INTO Dim_Date (date_key, full_date, year, quarter, month, month_name, day, day_name)</w:t>
+              <w:br/>
+              <w:t xml:space="preserve">                      VALUES (?, ?, ?, ?, ?, ?, ?, ?)''',</w:t>
+              <w:br/>
+              <w:t xml:space="preserve">                   (int(d.strftime("%Y%m%d")), d.strftime("%Y-%m-%d"), d.year, d.quarter, d.month, d.strftime("%B"), d.day, d.strftime("%A")))</w:t>
+              <w:br/>
+              <w:t xml:space="preserve"/>
+              <w:br/>
+              <w:t xml:space="preserve">dim_cust_df = pd.read_sql("SELECT customer_key, customer_id FROM Dim_Customer", conn)</w:t>
+              <w:br/>
+              <w:t xml:space="preserve">dim_prod_df = pd.read_sql("SELECT product_key, product_id FROM Dim_Product", conn)</w:t>
+              <w:br/>
+              <w:t xml:space="preserve">dim_date_df = pd.read_sql("SELECT date_key, full_date FROM Dim_Date", conn)</w:t>
+              <w:br/>
+              <w:t xml:space="preserve"/>
+              <w:br/>
+              <w:t xml:space="preserve">fact_prep = df_transformed.merge(dim_cust_df, on="customer_id", how="inner") \</w:t>
+              <w:br/>
+              <w:t xml:space="preserve">                           .merge(dim_prod_df, on="product_id", how="inner") \</w:t>
+              <w:br/>
+              <w:t xml:space="preserve">                           .merge(dim_date_df, left_on="order_date", right_on="full_date", how="inner")</w:t>
+              <w:br/>
+              <w:t xml:space="preserve"/>
+              <w:br/>
+              <w:t xml:space="preserve">fact_records = fact_prep[["customer_key", "product_key", "date_key", "order_id", </w:t>
+              <w:br/>
+              <w:t xml:space="preserve">                          "quantity", "gross_amount", "discount_amount", "net_amount", "profit"]]</w:t>
+              <w:br/>
+              <w:t xml:space="preserve">fact_records.to_sql("Fact_Sales", conn, if_exists="append", index=False)</w:t>
+              <w:br/>
+              <w:t xml:space="preserve">conn.commit()</w:t>
+              <w:br/>
+              <w:t xml:space="preserve">print("Star Schema Data Warehouse Successfully Built and Populated.")</w:t>
             </w:r>
           </w:p>
         </w:tc>
@@ -6869,24 +6761,18 @@
       </w:r>
     </w:p>
     <w:p>
-      <w:r>
-        <w:t>Name: Om Bichave &amp; Aryan Rane</w:t>
-      </w:r>
-      <w:r>
-        <w:br/>
-      </w:r>
-      <w:r>
-        <w:br/>
-      </w:r>
+      <w:pPr>
+        <w:spacing w:before="120" w:after="160"/>
+      </w:pPr>
       <w:r>
         <w:rPr>
           <w:noProof/>
         </w:rPr>
         <w:drawing>
-          <wp:inline distT="0" distB="0" distL="0" distR="0" wp14:anchorId="61AB1A05" wp14:editId="7C1229A0">
-            <wp:extent cx="5915851" cy="485843"/>
-            <wp:effectExtent l="0" t="0" r="0" b="9525"/>
-            <wp:docPr id="370894045" name="Picture 370894045"/>
+          <wp:inline distT="0" distB="0" distL="0" distR="0">
+            <wp:extent cx="5486400" cy="2530138"/>
+            <wp:effectExtent l="0" t="0" r="0" b="0"/>
+            <wp:docPr id="700000002" name="Picture 700000002"/>
             <wp:cNvGraphicFramePr>
               <a:graphicFrameLocks xmlns:a="http://schemas.openxmlformats.org/drawingml/2006/main" noChangeAspect="1"/>
             </wp:cNvGraphicFramePr>
@@ -6894,7 +6780,7 @@
               <a:graphicData uri="http://schemas.openxmlformats.org/drawingml/2006/picture">
                 <pic:pic xmlns:pic="http://schemas.openxmlformats.org/drawingml/2006/picture">
                   <pic:nvPicPr>
-                    <pic:cNvPr id="1" name=""/>
+                    <pic:cNvPr id="700000002" name=""/>
                     <pic:cNvPicPr/>
                   </pic:nvPicPr>
                   <pic:blipFill>
@@ -6906,7 +6792,7 @@
                   <pic:spPr>
                     <a:xfrm>
                       <a:off x="0" y="0"/>
-                      <a:ext cx="5915851" cy="485843"/>
+                      <a:ext cx="5486400" cy="2530138"/>
                     </a:xfrm>
                     <a:prstGeom prst="rect">
                       <a:avLst/>
@@ -6924,7 +6810,7 @@
         <w:pStyle w:val="Heading2"/>
       </w:pPr>
       <w:r>
-        <w:t>Task 3: Automated Alerting &amp; Incident Log Persistence</w:t>
+        <w:t>Task 3: Business Intelligence, Analytical OLAP Queries &amp; Executive Reporting</w:t>
       </w:r>
     </w:p>
     <w:p>
@@ -6966,182 +6852,105 @@
                 <w:sz w:val="18"/>
                 <w:szCs w:val="18"/>
               </w:rPr>
-              <w:t>print("Name: Om Bichave &amp; Aryan Rane")</w:t>
-              <w:br/>
-              <w:br/>
-              <w:t>import sqlite3</w:t>
-              <w:br/>
-              <w:br/>
-              <w:t>conn = sqlite3.connect("stream_monitoring.db")</w:t>
-              <w:br/>
-              <w:br/>
-              <w:t>def route_alerts_and_persist(anomalies_df, db_conn):</w:t>
-              <w:br/>
-              <w:t xml:space="preserve">    if not anomalies_df.empty:</w:t>
-              <w:br/>
-              <w:t xml:space="preserve">        # Persist to database security log table</w:t>
-              <w:br/>
-              <w:t xml:space="preserve">        anomalies_df.to_sql("incident_alerts", db_conn, if_exists="append", index=False)</w:t>
-              <w:br/>
-              <w:t xml:space="preserve">        </w:t>
-              <w:br/>
-              <w:t xml:space="preserve">        # Automated Notification Dispatcher Simulation</w:t>
-              <w:br/>
-              <w:t xml:space="preserve">        for idx, row in anomalies_df.iterrows():</w:t>
-              <w:br/>
-              <w:t xml:space="preserve">            print(f"[ALERT TRIGGERED] Txn {row['transaction_id']} by User {row['user_id']} flagged! Amount: ${row['amount']:.2f}. Reason: {row['flag_reason']}")</w:t>
-              <w:br/>
-              <w:t xml:space="preserve">    else:</w:t>
-              <w:br/>
-              <w:t xml:space="preserve">        print("[SYSTEM NORMAL] No anomalies detected in stream.")</w:t>
-              <w:br/>
-              <w:br/>
-              <w:t>route_alerts_and_persist(detected_anomalies, conn)</w:t>
-            </w:r>
-          </w:p>
-          <w:p>
-            <w:pPr>
-              <w:spacing w:after="0" w:line="252" w:lineRule="auto"/>
-            </w:pPr>
-            <w:r>
-              <w:rPr>
-                <w:rFonts w:ascii="Consolas" w:hAnsi="Consolas"/>
-                <w:color w:val="282828"/>
-                <w:sz w:val="18"/>
-              </w:rPr>
-              <w:t>import pandas as pd, sqlite3</w:t>
-            </w:r>
-          </w:p>
-          <w:p>
-            <w:pPr>
-              <w:spacing w:after="0" w:line="252" w:lineRule="auto"/>
-            </w:pPr>
-          </w:p>
-          <w:p>
-            <w:pPr>
-              <w:spacing w:after="0" w:line="252" w:lineRule="auto"/>
-            </w:pPr>
-            <w:r>
-              <w:rPr>
-                <w:rFonts w:ascii="Consolas" w:hAnsi="Consolas"/>
-                <w:color w:val="282828"/>
-                <w:sz w:val="18"/>
-              </w:rPr>
-              <w:t>conn = sqlite3.connect("ecommerce_pipeline.db")</w:t>
-            </w:r>
-          </w:p>
-          <w:p>
-            <w:pPr>
-              <w:spacing w:after="0" w:line="252" w:lineRule="auto"/>
-            </w:pPr>
-          </w:p>
-          <w:p>
-            <w:pPr>
-              <w:spacing w:after="0" w:line="252" w:lineRule="auto"/>
-            </w:pPr>
-            <w:r>
-              <w:rPr>
-                <w:rFonts w:ascii="Consolas" w:hAnsi="Consolas"/>
-                <w:color w:val="282828"/>
-                <w:sz w:val="18"/>
-              </w:rPr>
-              <w:t>def process_new_data(incoming_df, db_conn):</w:t>
-            </w:r>
-          </w:p>
-          <w:p>
-            <w:pPr>
-              <w:spacing w:after="0" w:line="252" w:lineRule="auto"/>
-            </w:pPr>
-            <w:r>
-              <w:rPr>
-                <w:rFonts w:ascii="Consolas" w:hAnsi="Consolas"/>
-                <w:color w:val="282828"/>
-                <w:sz w:val="18"/>
-              </w:rPr>
-              <w:t xml:space="preserve">    existing = pd.read_sql("SELECT order_id FROM cleaned_orders", db_conn)["order_id"].tolist()</w:t>
-            </w:r>
-          </w:p>
-          <w:p>
-            <w:pPr>
-              <w:spacing w:after="0" w:line="252" w:lineRule="auto"/>
-            </w:pPr>
-            <w:r>
-              <w:rPr>
-                <w:rFonts w:ascii="Consolas" w:hAnsi="Consolas"/>
-                <w:color w:val="282828"/>
-                <w:sz w:val="18"/>
-              </w:rPr>
-              <w:t xml:space="preserve">    new_data = incoming_df[~incoming_df["order_id"].isin(existing)].copy()</w:t>
-            </w:r>
-          </w:p>
-          <w:p>
-            <w:pPr>
-              <w:spacing w:after="0" w:line="252" w:lineRule="auto"/>
-            </w:pPr>
-            <w:r>
-              <w:rPr>
-                <w:rFonts w:ascii="Consolas" w:hAnsi="Consolas"/>
-                <w:color w:val="282828"/>
-                <w:sz w:val="18"/>
-              </w:rPr>
-              <w:t xml:space="preserve">    if not new_data.empty:</w:t>
-            </w:r>
-          </w:p>
-          <w:p>
-            <w:pPr>
-              <w:spacing w:after="0" w:line="252" w:lineRule="auto"/>
-            </w:pPr>
-            <w:r>
-              <w:rPr>
-                <w:rFonts w:ascii="Consolas" w:hAnsi="Consolas"/>
-                <w:color w:val="282828"/>
-                <w:sz w:val="18"/>
-              </w:rPr>
-              <w:t xml:space="preserve">        new_data["total_amount"] = new_data["quantity"] * new_data["price"]</w:t>
-            </w:r>
-          </w:p>
-          <w:p>
-            <w:pPr>
-              <w:spacing w:after="0" w:line="252" w:lineRule="auto"/>
-            </w:pPr>
-            <w:r>
-              <w:rPr>
-                <w:rFonts w:ascii="Consolas" w:hAnsi="Consolas"/>
-                <w:color w:val="282828"/>
-                <w:sz w:val="18"/>
-              </w:rPr>
-              <w:t xml:space="preserve">        new_data.to_sql("cleaned_orders", db_conn, if_exists="append", index=False)</w:t>
-            </w:r>
-          </w:p>
-          <w:p>
-            <w:pPr>
-              <w:spacing w:after="0" w:line="252" w:lineRule="auto"/>
-            </w:pPr>
-            <w:r>
-              <w:rPr>
-                <w:rFonts w:ascii="Consolas" w:hAnsi="Consolas"/>
-                <w:color w:val="282828"/>
-                <w:sz w:val="18"/>
-              </w:rPr>
-              <w:t xml:space="preserve">        print(f"Successfully processed and appended {len(new_data)} new records.")</w:t>
-            </w:r>
-          </w:p>
-          <w:p>
-            <w:pPr>
-              <w:spacing w:after="0" w:line="252" w:lineRule="auto"/>
-            </w:pPr>
-          </w:p>
-          <w:p>
-            <w:pPr>
-              <w:spacing w:after="0" w:line="252" w:lineRule="auto"/>
-            </w:pPr>
-            <w:r>
-              <w:rPr>
-                <w:rFonts w:ascii="Consolas" w:hAnsi="Consolas"/>
-                <w:color w:val="282828"/>
-                <w:sz w:val="18"/>
-              </w:rPr>
-              <w:t>process_new_data(new_arriving_data, conn)</w:t>
+              <w:t xml:space="preserve"># Group Members: Om Bichave &amp; Aryan Rane</w:t>
+              <w:br/>
+              <w:t xml:space="preserve">import sqlite3</w:t>
+              <w:br/>
+              <w:t xml:space="preserve">import pandas as pd</w:t>
+              <w:br/>
+              <w:t xml:space="preserve"/>
+              <w:br/>
+              <w:t xml:space="preserve">conn = sqlite3.connect("enterprise_data_warehouse.db")</w:t>
+              <w:br/>
+              <w:t xml:space="preserve"/>
+              <w:br/>
+              <w:t xml:space="preserve"># KPI 1: Executive Financial Overview</w:t>
+              <w:br/>
+              <w:t xml:space="preserve">q1 = '''SELECT </w:t>
+              <w:br/>
+              <w:t xml:space="preserve">    COUNT(sales_key) AS total_orders,</w:t>
+              <w:br/>
+              <w:t xml:space="preserve">    SUM(quantity) AS total_units_sold,</w:t>
+              <w:br/>
+              <w:t xml:space="preserve">    PRINTF('$%,.2f', SUM(gross_amount)) AS total_gross_sales,</w:t>
+              <w:br/>
+              <w:t xml:space="preserve">    PRINTF('$%,.2f', SUM(discount_amount)) AS total_discounts,</w:t>
+              <w:br/>
+              <w:t xml:space="preserve">    PRINTF('$%,.2f', SUM(net_amount)) AS total_net_revenue,</w:t>
+              <w:br/>
+              <w:t xml:space="preserve">    PRINTF('$%,.2f', SUM(profit)) AS total_profit,</w:t>
+              <w:br/>
+              <w:t xml:space="preserve">    PRINTF('%.2f%%', (SUM(profit) / SUM(net_amount)) * 100) AS overall_profit_margin</w:t>
+              <w:br/>
+              <w:t xml:space="preserve">FROM Fact_Sales;'''</w:t>
+              <w:br/>
+              <w:t xml:space="preserve">print("--- KPI 1: EXECUTIVE FINANCIAL OVERVIEW ---")</w:t>
+              <w:br/>
+              <w:t xml:space="preserve">print(pd.read_sql(q1, conn).to_string(index=False))</w:t>
+              <w:br/>
+              <w:t xml:space="preserve"/>
+              <w:br/>
+              <w:t xml:space="preserve"># KPI 2: Category Profitability &amp; Margin Ranking</w:t>
+              <w:br/>
+              <w:t xml:space="preserve">q2 = '''SELECT </w:t>
+              <w:br/>
+              <w:t xml:space="preserve">    p.category, COUNT(f.sales_key) AS transactions, SUM(f.quantity) AS units_sold,</w:t>
+              <w:br/>
+              <w:t xml:space="preserve">    PRINTF('$%,.2f', SUM(f.net_amount)) AS net_revenue,</w:t>
+              <w:br/>
+              <w:t xml:space="preserve">    PRINTF('$%,.2f', SUM(f.profit)) AS net_profit,</w:t>
+              <w:br/>
+              <w:t xml:space="preserve">    PRINTF('%.2f%%', (SUM(f.profit) / SUM(f.net_amount)) * 100) AS margin_pct</w:t>
+              <w:br/>
+              <w:t xml:space="preserve">FROM Fact_Sales f JOIN Dim_Product p ON f.product_key = p.product_key</w:t>
+              <w:br/>
+              <w:t xml:space="preserve">GROUP BY p.category ORDER BY SUM(f.net_amount) DESC;'''</w:t>
+              <w:br/>
+              <w:t xml:space="preserve">print("\n--- KPI 2: CATEGORY PERFORMANCE &amp; PROFITABILITY ---")</w:t>
+              <w:br/>
+              <w:t xml:space="preserve">print(pd.read_sql(q2, conn).to_string(index=False))</w:t>
+              <w:br/>
+              <w:t xml:space="preserve"/>
+              <w:br/>
+              <w:t xml:space="preserve"># KPI 3: Regional Revenue &amp; Customer Tier Distribution</w:t>
+              <w:br/>
+              <w:t xml:space="preserve">q3 = '''SELECT </w:t>
+              <w:br/>
+              <w:t xml:space="preserve">    c.city, c.tier, COUNT(DISTINCT c.customer_id) AS customer_count,</w:t>
+              <w:br/>
+              <w:t xml:space="preserve">    SUM(f.quantity) AS total_items,</w:t>
+              <w:br/>
+              <w:t xml:space="preserve">    PRINTF('$%,.2f', SUM(f.net_amount)) AS regional_revenue</w:t>
+              <w:br/>
+              <w:t xml:space="preserve">FROM Fact_Sales f JOIN Dim_Customer c ON f.customer_key = c.customer_key</w:t>
+              <w:br/>
+              <w:t xml:space="preserve">GROUP BY c.city, c.tier ORDER BY SUM(f.net_amount) DESC;'''</w:t>
+              <w:br/>
+              <w:t xml:space="preserve">print("\n--- KPI 3: REGIONAL REVENUE &amp; CUSTOMER TIER BREAKDOWN ---")</w:t>
+              <w:br/>
+              <w:t xml:space="preserve">print(pd.read_sql(q3, conn).to_string(index=False))</w:t>
+              <w:br/>
+              <w:t xml:space="preserve"/>
+              <w:br/>
+              <w:t xml:space="preserve"># KPI 4: Monthly Sales Trend Analysis</w:t>
+              <w:br/>
+              <w:t xml:space="preserve">q4 = '''SELECT </w:t>
+              <w:br/>
+              <w:t xml:space="preserve">    d.year, d.month_name AS month, COUNT(f.sales_key) AS order_volume, SUM(f.quantity) AS units,</w:t>
+              <w:br/>
+              <w:t xml:space="preserve">    PRINTF('$%,.2f', SUM(f.net_amount)) AS monthly_revenue,</w:t>
+              <w:br/>
+              <w:t xml:space="preserve">    PRINTF('$%,.2f', AVG(f.net_amount)) AS avg_order_value</w:t>
+              <w:br/>
+              <w:t xml:space="preserve">FROM Fact_Sales f JOIN Dim_Date d ON f.date_key = d.date_key</w:t>
+              <w:br/>
+              <w:t xml:space="preserve">GROUP BY d.year, d.month, d.month_name ORDER BY d.year, d.month;'''</w:t>
+              <w:br/>
+              <w:t xml:space="preserve">print("\n--- KPI 4: MONTHLY SALES TREND ANALYSIS ---")</w:t>
+              <w:br/>
+              <w:t xml:space="preserve">print(pd.read_sql(q4, conn).to_string(index=False))</w:t>
+              <w:br/>
+              <w:t xml:space="preserve">conn.close()</w:t>
             </w:r>
           </w:p>
         </w:tc>
@@ -7154,23 +6963,17 @@
     </w:p>
     <w:p>
       <w:pPr>
-        <w:spacing w:before="320" w:after="80"/>
-        <w:rPr>
-          <w:rFonts w:ascii="Calibri" w:hAnsi="Calibri"/>
-          <w:b/>
-          <w:color w:val="003366"/>
-          <w:sz w:val="28"/>
-        </w:rPr>
+        <w:spacing w:before="120" w:after="160"/>
       </w:pPr>
       <w:r>
         <w:rPr>
           <w:noProof/>
         </w:rPr>
         <w:drawing>
-          <wp:inline distT="0" distB="0" distL="0" distR="0" wp14:anchorId="5FD3C9F9" wp14:editId="5AF83032">
-            <wp:extent cx="5943600" cy="304165"/>
-            <wp:effectExtent l="0" t="0" r="0" b="635"/>
-            <wp:docPr id="668449140" name="Picture 668449140"/>
+          <wp:inline distT="0" distB="0" distL="0" distR="0">
+            <wp:extent cx="5486400" cy="3240176"/>
+            <wp:effectExtent l="0" t="0" r="0" b="0"/>
+            <wp:docPr id="700000003" name="Picture 700000003"/>
             <wp:cNvGraphicFramePr>
               <a:graphicFrameLocks xmlns:a="http://schemas.openxmlformats.org/drawingml/2006/main" noChangeAspect="1"/>
             </wp:cNvGraphicFramePr>
@@ -7178,7 +6981,7 @@
               <a:graphicData uri="http://schemas.openxmlformats.org/drawingml/2006/picture">
                 <pic:pic xmlns:pic="http://schemas.openxmlformats.org/drawingml/2006/picture">
                   <pic:nvPicPr>
-                    <pic:cNvPr id="1" name=""/>
+                    <pic:cNvPr id="700000003" name=""/>
                     <pic:cNvPicPr/>
                   </pic:nvPicPr>
                   <pic:blipFill>
@@ -7190,7 +6993,7 @@
                   <pic:spPr>
                     <a:xfrm>
                       <a:off x="0" y="0"/>
-                      <a:ext cx="5943600" cy="304165"/>
+                      <a:ext cx="5486400" cy="3240176"/>
                     </a:xfrm>
                     <a:prstGeom prst="rect">
                       <a:avLst/>

</xml_diff>